<commit_message>
Simplify evidence cards: remove titles, write-in evidence type, larger evidence box
</commit_message>
<xml_diff>
--- a/teacher-resources/Evidence_Wall_Cards_A4_Portrait.docx
+++ b/teacher-resources/Evidence_Wall_Cards_A4_Portrait.docx
@@ -2,110 +2,19 @@
 <file path=word/document.xml><?xml version="1.0" encoding="utf-8"?>
 <w:document xmlns:wpc="http://schemas.microsoft.com/office/word/2010/wordprocessingCanvas" xmlns:mc="http://schemas.openxmlformats.org/markup-compatibility/2006" xmlns:o="urn:schemas-microsoft-com:office:office" xmlns:r="http://schemas.openxmlformats.org/officeDocument/2006/relationships" xmlns:m="http://schemas.openxmlformats.org/officeDocument/2006/math" xmlns:v="urn:schemas-microsoft-com:vml" xmlns:wp14="http://schemas.microsoft.com/office/word/2010/wordprocessingDrawing" xmlns:wp="http://schemas.openxmlformats.org/drawingml/2006/wordprocessingDrawing" xmlns:w10="urn:schemas-microsoft-com:office:word" xmlns:w="http://schemas.openxmlformats.org/wordprocessingml/2006/main" xmlns:w14="http://schemas.microsoft.com/office/word/2010/wordml" xmlns:w15="http://schemas.microsoft.com/office/word/2012/wordml" xmlns:wpg="http://schemas.microsoft.com/office/word/2010/wordprocessingGroup" xmlns:wpi="http://schemas.microsoft.com/office/word/2010/wordprocessingInk" xmlns:wne="http://schemas.microsoft.com/office/word/2006/wordml" xmlns:wps="http://schemas.microsoft.com/office/word/2010/wordprocessingShape" xmlns:cx="http://schemas.microsoft.com/office/drawing/2014/chartex" xmlns:cx1="http://schemas.microsoft.com/office/drawing/2015/9/8/chartex" xmlns:cx2="http://schemas.microsoft.com/office/drawing/2015/10/21/chartex" xmlns:cx3="http://schemas.microsoft.com/office/drawing/2016/5/9/chartex" xmlns:cx4="http://schemas.microsoft.com/office/drawing/2016/5/10/chartex" xmlns:cx5="http://schemas.microsoft.com/office/drawing/2016/5/11/chartex" xmlns:cx6="http://schemas.microsoft.com/office/drawing/2016/5/12/chartex" xmlns:cx7="http://schemas.microsoft.com/office/drawing/2016/5/13/chartex" xmlns:cx8="http://schemas.microsoft.com/office/drawing/2016/5/14/chartex" xmlns:aink="http://schemas.microsoft.com/office/drawing/2016/ink" xmlns:am3d="http://schemas.microsoft.com/office/drawing/2017/model3d" xmlns:w16cex="http://schemas.microsoft.com/office/word/2018/wordml/cex" xmlns:w16cid="http://schemas.microsoft.com/office/word/2016/wordml/cid" xmlns:w16="http://schemas.microsoft.com/office/word/2018/wordml" xmlns:w16sdtdh="http://schemas.microsoft.com/office/word/2020/wordml/sdtdatahash" xmlns:w16se="http://schemas.microsoft.com/office/word/2015/wordml/symex" mc:Ignorable="w14 w15 wp14">
   <w:body>
-    <w:tbl>
-      <w:tblPr>
-        <w:tblW w:type="dxa" w:w="9906"/>
-        <w:tblBorders>
-          <w:top w:val="none" w:color="FFFFFF" w:sz="0"/>
-          <w:left w:val="none" w:color="FFFFFF" w:sz="0"/>
-          <w:bottom w:val="none" w:color="FFFFFF" w:sz="0"/>
-          <w:right w:val="none" w:color="FFFFFF" w:sz="0"/>
-          <w:insideH w:val="single" w:color="auto" w:sz="4"/>
-          <w:insideV w:val="single" w:color="auto" w:sz="4"/>
-        </w:tblBorders>
-      </w:tblPr>
-      <w:tblGrid>
-        <w:gridCol w:w="200"/>
-        <w:gridCol w:w="9706"/>
-      </w:tblGrid>
-      <w:tr>
-        <w:tc>
-          <w:tcPr>
-            <w:tcW w:type="dxa" w:w="200"/>
-            <w:tcBorders>
-              <w:top w:val="none" w:color="FFFFFF" w:sz="0"/>
-              <w:left w:val="none" w:color="FFFFFF" w:sz="0"/>
-              <w:bottom w:val="none" w:color="FFFFFF" w:sz="0"/>
-              <w:right w:val="none" w:color="FFFFFF" w:sz="0"/>
-            </w:tcBorders>
-            <w:shd w:fill="BDD675" w:val="clear"/>
-          </w:tcPr>
-          <w:p>
-            <w:r>
-              <w:t xml:space="preserve"/>
-            </w:r>
-          </w:p>
-        </w:tc>
-        <w:tc>
-          <w:tcPr>
-            <w:tcW w:type="dxa" w:w="9706"/>
-            <w:tcBorders>
-              <w:top w:val="none" w:color="FFFFFF" w:sz="0"/>
-              <w:left w:val="none" w:color="FFFFFF" w:sz="0"/>
-              <w:bottom w:val="none" w:color="FFFFFF" w:sz="0"/>
-              <w:right w:val="none" w:color="FFFFFF" w:sz="0"/>
-            </w:tcBorders>
-            <w:shd w:fill="F0F6E1" w:val="clear"/>
-            <w:tcMar>
-              <w:top w:type="dxa" w:w="160"/>
-              <w:left w:type="dxa" w:w="240"/>
-              <w:bottom w:type="dxa" w:w="160"/>
-              <w:right w:type="dxa" w:w="240"/>
-            </w:tcMar>
-          </w:tcPr>
-          <w:p>
-            <w:r>
-              <w:rPr>
-                <w:rFonts w:ascii="Calibri" w:cs="Calibri" w:eastAsia="Calibri" w:hAnsi="Calibri"/>
-                <w:b/>
-                <w:bCs/>
-                <w:color w:val="013148"/>
-                <w:spacing w:val="30"/>
-                <w:sz w:val="20"/>
-                <w:szCs w:val="20"/>
-              </w:rPr>
-              <w:t xml:space="preserve">MISSION 1  ·  GRAVITY SPECIALIST</w:t>
-            </w:r>
-          </w:p>
-          <w:p>
-            <w:pPr>
-              <w:spacing w:before="60"/>
-            </w:pPr>
-            <w:r>
-              <w:rPr>
-                <w:rFonts w:ascii="Calibri" w:cs="Calibri" w:eastAsia="Calibri" w:hAnsi="Calibri"/>
-                <w:b/>
-                <w:bCs/>
-                <w:color w:val="013148"/>
-                <w:sz w:val="52"/>
-                <w:szCs w:val="52"/>
-              </w:rPr>
-              <w:t xml:space="preserve">Why Don't We Fall Into Space?</w:t>
-            </w:r>
-          </w:p>
-          <w:p>
-            <w:pPr>
-              <w:spacing w:before="60"/>
-            </w:pPr>
-            <w:r>
-              <w:rPr>
-                <w:rFonts w:ascii="Calibri" w:cs="Calibri" w:eastAsia="Calibri" w:hAnsi="Calibri"/>
-                <w:i/>
-                <w:iCs/>
-                <w:color w:val="5B7482"/>
-                <w:sz w:val="24"/>
-                <w:szCs w:val="24"/>
-              </w:rPr>
-              <w:t xml:space="preserve">Mission question: “What keeps us on Earth's surface?”</w:t>
-            </w:r>
-          </w:p>
-        </w:tc>
-      </w:tr>
-    </w:tbl>
-    <w:p>
-      <w:pPr>
-        <w:spacing w:after="160"/>
-      </w:pPr>
+    <w:p>
+      <w:r>
+        <w:rPr>
+          <w:rFonts w:ascii="Calibri" w:cs="Calibri" w:eastAsia="Calibri" w:hAnsi="Calibri"/>
+          <w:b/>
+          <w:bCs/>
+          <w:color w:val="BDD675"/>
+          <w:spacing w:val="40"/>
+          <w:sz w:val="20"/>
+          <w:szCs w:val="20"/>
+        </w:rPr>
+        <w:t xml:space="preserve">MISSION 1</w:t>
+      </w:r>
     </w:p>
     <w:p>
       <w:pPr>
@@ -151,32 +60,22 @@
           <w:sz w:val="24"/>
           <w:szCs w:val="24"/>
         </w:rPr>
-        <w:t xml:space="preserve">OUR EVIDENCE TYPE  —  tick all that apply</w:t>
-      </w:r>
-    </w:p>
-    <w:p>
-      <w:pPr>
-        <w:spacing w:after="60"/>
-      </w:pPr>
-      <w:r>
-        <w:rPr>
-          <w:rFonts w:ascii="Calibri" w:cs="Calibri" w:eastAsia="Calibri" w:hAnsi="Calibri"/>
-          <w:color w:val="013148"/>
-          <w:sz w:val="24"/>
-          <w:szCs w:val="24"/>
-        </w:rPr>
-        <w:t xml:space="preserve">☐ Graph      ☐ Model      ☐ Photograph      ☐ Diagram</w:t>
-      </w:r>
-    </w:p>
-    <w:p>
-      <w:r>
-        <w:rPr>
-          <w:rFonts w:ascii="Calibri" w:cs="Calibri" w:eastAsia="Calibri" w:hAnsi="Calibri"/>
-          <w:color w:val="013148"/>
-          <w:sz w:val="24"/>
-          <w:szCs w:val="24"/>
-        </w:rPr>
-        <w:t xml:space="preserve">☐ Observation      ☐ Data      ☐ Scientific explanation</w:t>
+        <w:t xml:space="preserve">TYPE OF EVIDENCE</w:t>
+      </w:r>
+    </w:p>
+    <w:p>
+      <w:pPr>
+        <w:pBdr>
+          <w:bottom w:val="single" w:color="9DB4BE" w:sz="6" w:space="1"/>
+        </w:pBdr>
+        <w:spacing w:before="320"/>
+      </w:pPr>
+      <w:r>
+        <w:rPr>
+          <w:sz w:val="24"/>
+          <w:szCs w:val="24"/>
+        </w:rPr>
+        <w:t xml:space="preserve"> </w:t>
       </w:r>
     </w:p>
     <w:p>
@@ -212,7 +111,7 @@
       </w:tblGrid>
       <w:tr>
         <w:trPr>
-          <w:trHeight w:val="6600" w:hRule="atLeast"/>
+          <w:trHeight w:val="9700" w:hRule="atLeast"/>
         </w:trPr>
         <w:tc>
           <w:tcPr>
@@ -280,7 +179,7 @@
     </w:p>
     <w:p>
       <w:pPr>
-        <w:spacing w:before="300"/>
+        <w:spacing w:before="240"/>
         <w:jc w:val="center"/>
       </w:pPr>
       <w:r>
@@ -297,7 +196,7 @@
       <w:pPr>
         <w:sectPr>
           <w:pgSz w:w="11906" w:h="16838" w:orient="portrait"/>
-          <w:pgMar w:top="900" w:right="1000" w:bottom="700" w:left="1000" w:header="708" w:footer="708" w:gutter="0"/>
+          <w:pgMar w:top="800" w:right="1000" w:bottom="600" w:left="1000" w:header="708" w:footer="708" w:gutter="0"/>
           <w:pgBorders w:display="allPages" w:offsetFrom="page">
             <w:top w:val="single" w:color="BDD675" w:sz="28" w:space="20"/>
             <w:left w:val="single" w:color="BDD675" w:sz="28" w:space="20"/>
@@ -309,110 +208,19 @@
         </w:sectPr>
       </w:pPr>
     </w:p>
-    <w:tbl>
-      <w:tblPr>
-        <w:tblW w:type="dxa" w:w="9906"/>
-        <w:tblBorders>
-          <w:top w:val="none" w:color="FFFFFF" w:sz="0"/>
-          <w:left w:val="none" w:color="FFFFFF" w:sz="0"/>
-          <w:bottom w:val="none" w:color="FFFFFF" w:sz="0"/>
-          <w:right w:val="none" w:color="FFFFFF" w:sz="0"/>
-          <w:insideH w:val="single" w:color="auto" w:sz="4"/>
-          <w:insideV w:val="single" w:color="auto" w:sz="4"/>
-        </w:tblBorders>
-      </w:tblPr>
-      <w:tblGrid>
-        <w:gridCol w:w="200"/>
-        <w:gridCol w:w="9706"/>
-      </w:tblGrid>
-      <w:tr>
-        <w:tc>
-          <w:tcPr>
-            <w:tcW w:type="dxa" w:w="200"/>
-            <w:tcBorders>
-              <w:top w:val="none" w:color="FFFFFF" w:sz="0"/>
-              <w:left w:val="none" w:color="FFFFFF" w:sz="0"/>
-              <w:bottom w:val="none" w:color="FFFFFF" w:sz="0"/>
-              <w:right w:val="none" w:color="FFFFFF" w:sz="0"/>
-            </w:tcBorders>
-            <w:shd w:fill="F46E63" w:val="clear"/>
-          </w:tcPr>
-          <w:p>
-            <w:r>
-              <w:t xml:space="preserve"/>
-            </w:r>
-          </w:p>
-        </w:tc>
-        <w:tc>
-          <w:tcPr>
-            <w:tcW w:type="dxa" w:w="9706"/>
-            <w:tcBorders>
-              <w:top w:val="none" w:color="FFFFFF" w:sz="0"/>
-              <w:left w:val="none" w:color="FFFFFF" w:sz="0"/>
-              <w:bottom w:val="none" w:color="FFFFFF" w:sz="0"/>
-              <w:right w:val="none" w:color="FFFFFF" w:sz="0"/>
-            </w:tcBorders>
-            <w:shd w:fill="FDE5E3" w:val="clear"/>
-            <w:tcMar>
-              <w:top w:type="dxa" w:w="160"/>
-              <w:left w:type="dxa" w:w="240"/>
-              <w:bottom w:type="dxa" w:w="160"/>
-              <w:right w:type="dxa" w:w="240"/>
-            </w:tcMar>
-          </w:tcPr>
-          <w:p>
-            <w:r>
-              <w:rPr>
-                <w:rFonts w:ascii="Calibri" w:cs="Calibri" w:eastAsia="Calibri" w:hAnsi="Calibri"/>
-                <w:b/>
-                <w:bCs/>
-                <w:color w:val="013148"/>
-                <w:spacing w:val="30"/>
-                <w:sz w:val="20"/>
-                <w:szCs w:val="20"/>
-              </w:rPr>
-              <w:t xml:space="preserve">MISSION 2  ·  EARTH ROTATION EXPERT</w:t>
-            </w:r>
-          </w:p>
-          <w:p>
-            <w:pPr>
-              <w:spacing w:before="60"/>
-            </w:pPr>
-            <w:r>
-              <w:rPr>
-                <w:rFonts w:ascii="Calibri" w:cs="Calibri" w:eastAsia="Calibri" w:hAnsi="Calibri"/>
-                <w:b/>
-                <w:bCs/>
-                <w:color w:val="013148"/>
-                <w:sz w:val="52"/>
-                <w:szCs w:val="52"/>
-              </w:rPr>
-              <w:t xml:space="preserve">Why Does the Sun Seem to Move?</w:t>
-            </w:r>
-          </w:p>
-          <w:p>
-            <w:pPr>
-              <w:spacing w:before="60"/>
-            </w:pPr>
-            <w:r>
-              <w:rPr>
-                <w:rFonts w:ascii="Calibri" w:cs="Calibri" w:eastAsia="Calibri" w:hAnsi="Calibri"/>
-                <w:i/>
-                <w:iCs/>
-                <w:color w:val="5B7482"/>
-                <w:sz w:val="24"/>
-                <w:szCs w:val="24"/>
-              </w:rPr>
-              <w:t xml:space="preserve">Mission question: “What causes day and night?”</w:t>
-            </w:r>
-          </w:p>
-        </w:tc>
-      </w:tr>
-    </w:tbl>
-    <w:p>
-      <w:pPr>
-        <w:spacing w:after="160"/>
-      </w:pPr>
+    <w:p>
+      <w:r>
+        <w:rPr>
+          <w:rFonts w:ascii="Calibri" w:cs="Calibri" w:eastAsia="Calibri" w:hAnsi="Calibri"/>
+          <w:b/>
+          <w:bCs/>
+          <w:color w:val="F46E63"/>
+          <w:spacing w:val="40"/>
+          <w:sz w:val="20"/>
+          <w:szCs w:val="20"/>
+        </w:rPr>
+        <w:t xml:space="preserve">MISSION 2</w:t>
+      </w:r>
     </w:p>
     <w:p>
       <w:pPr>
@@ -458,32 +266,22 @@
           <w:sz w:val="24"/>
           <w:szCs w:val="24"/>
         </w:rPr>
-        <w:t xml:space="preserve">OUR EVIDENCE TYPE  —  tick all that apply</w:t>
-      </w:r>
-    </w:p>
-    <w:p>
-      <w:pPr>
-        <w:spacing w:after="60"/>
-      </w:pPr>
-      <w:r>
-        <w:rPr>
-          <w:rFonts w:ascii="Calibri" w:cs="Calibri" w:eastAsia="Calibri" w:hAnsi="Calibri"/>
-          <w:color w:val="013148"/>
-          <w:sz w:val="24"/>
-          <w:szCs w:val="24"/>
-        </w:rPr>
-        <w:t xml:space="preserve">☐ Graph      ☐ Model      ☐ Photograph      ☐ Diagram</w:t>
-      </w:r>
-    </w:p>
-    <w:p>
-      <w:r>
-        <w:rPr>
-          <w:rFonts w:ascii="Calibri" w:cs="Calibri" w:eastAsia="Calibri" w:hAnsi="Calibri"/>
-          <w:color w:val="013148"/>
-          <w:sz w:val="24"/>
-          <w:szCs w:val="24"/>
-        </w:rPr>
-        <w:t xml:space="preserve">☐ Observation      ☐ Data      ☐ Scientific explanation</w:t>
+        <w:t xml:space="preserve">TYPE OF EVIDENCE</w:t>
+      </w:r>
+    </w:p>
+    <w:p>
+      <w:pPr>
+        <w:pBdr>
+          <w:bottom w:val="single" w:color="9DB4BE" w:sz="6" w:space="1"/>
+        </w:pBdr>
+        <w:spacing w:before="320"/>
+      </w:pPr>
+      <w:r>
+        <w:rPr>
+          <w:sz w:val="24"/>
+          <w:szCs w:val="24"/>
+        </w:rPr>
+        <w:t xml:space="preserve"> </w:t>
       </w:r>
     </w:p>
     <w:p>
@@ -519,7 +317,7 @@
       </w:tblGrid>
       <w:tr>
         <w:trPr>
-          <w:trHeight w:val="6600" w:hRule="atLeast"/>
+          <w:trHeight w:val="9700" w:hRule="atLeast"/>
         </w:trPr>
         <w:tc>
           <w:tcPr>
@@ -587,7 +385,7 @@
     </w:p>
     <w:p>
       <w:pPr>
-        <w:spacing w:before="300"/>
+        <w:spacing w:before="240"/>
         <w:jc w:val="center"/>
       </w:pPr>
       <w:r>
@@ -604,7 +402,7 @@
       <w:pPr>
         <w:sectPr>
           <w:pgSz w:w="11906" w:h="16838" w:orient="portrait"/>
-          <w:pgMar w:top="900" w:right="1000" w:bottom="700" w:left="1000" w:header="708" w:footer="708" w:gutter="0"/>
+          <w:pgMar w:top="800" w:right="1000" w:bottom="600" w:left="1000" w:header="708" w:footer="708" w:gutter="0"/>
           <w:pgBorders w:display="allPages" w:offsetFrom="page">
             <w:top w:val="single" w:color="F46E63" w:sz="28" w:space="20"/>
             <w:left w:val="single" w:color="F46E63" w:sz="28" w:space="20"/>
@@ -616,110 +414,19 @@
         </w:sectPr>
       </w:pPr>
     </w:p>
-    <w:tbl>
-      <w:tblPr>
-        <w:tblW w:type="dxa" w:w="9906"/>
-        <w:tblBorders>
-          <w:top w:val="none" w:color="FFFFFF" w:sz="0"/>
-          <w:left w:val="none" w:color="FFFFFF" w:sz="0"/>
-          <w:bottom w:val="none" w:color="FFFFFF" w:sz="0"/>
-          <w:right w:val="none" w:color="FFFFFF" w:sz="0"/>
-          <w:insideH w:val="single" w:color="auto" w:sz="4"/>
-          <w:insideV w:val="single" w:color="auto" w:sz="4"/>
-        </w:tblBorders>
-      </w:tblPr>
-      <w:tblGrid>
-        <w:gridCol w:w="200"/>
-        <w:gridCol w:w="9706"/>
-      </w:tblGrid>
-      <w:tr>
-        <w:tc>
-          <w:tcPr>
-            <w:tcW w:type="dxa" w:w="200"/>
-            <w:tcBorders>
-              <w:top w:val="none" w:color="FFFFFF" w:sz="0"/>
-              <w:left w:val="none" w:color="FFFFFF" w:sz="0"/>
-              <w:bottom w:val="none" w:color="FFFFFF" w:sz="0"/>
-              <w:right w:val="none" w:color="FFFFFF" w:sz="0"/>
-            </w:tcBorders>
-            <w:shd w:fill="8FC9E8" w:val="clear"/>
-          </w:tcPr>
-          <w:p>
-            <w:r>
-              <w:t xml:space="preserve"/>
-            </w:r>
-          </w:p>
-        </w:tc>
-        <w:tc>
-          <w:tcPr>
-            <w:tcW w:type="dxa" w:w="9706"/>
-            <w:tcBorders>
-              <w:top w:val="none" w:color="FFFFFF" w:sz="0"/>
-              <w:left w:val="none" w:color="FFFFFF" w:sz="0"/>
-              <w:bottom w:val="none" w:color="FFFFFF" w:sz="0"/>
-              <w:right w:val="none" w:color="FFFFFF" w:sz="0"/>
-            </w:tcBorders>
-            <w:shd w:fill="ECF8FD" w:val="clear"/>
-            <w:tcMar>
-              <w:top w:type="dxa" w:w="160"/>
-              <w:left w:type="dxa" w:w="240"/>
-              <w:bottom w:type="dxa" w:w="160"/>
-              <w:right w:type="dxa" w:w="240"/>
-            </w:tcMar>
-          </w:tcPr>
-          <w:p>
-            <w:r>
-              <w:rPr>
-                <w:rFonts w:ascii="Calibri" w:cs="Calibri" w:eastAsia="Calibri" w:hAnsi="Calibri"/>
-                <w:b/>
-                <w:bCs/>
-                <w:color w:val="013148"/>
-                <w:spacing w:val="30"/>
-                <w:sz w:val="20"/>
-                <w:szCs w:val="20"/>
-              </w:rPr>
-              <w:t xml:space="preserve">MISSION 3  ·  SEASONS SCIENTIST</w:t>
-            </w:r>
-          </w:p>
-          <w:p>
-            <w:pPr>
-              <w:spacing w:before="60"/>
-            </w:pPr>
-            <w:r>
-              <w:rPr>
-                <w:rFonts w:ascii="Calibri" w:cs="Calibri" w:eastAsia="Calibri" w:hAnsi="Calibri"/>
-                <w:b/>
-                <w:bCs/>
-                <w:color w:val="013148"/>
-                <w:sz w:val="52"/>
-                <w:szCs w:val="52"/>
-              </w:rPr>
-              <w:t xml:space="preserve">Why Do We Have Seasons?</w:t>
-            </w:r>
-          </w:p>
-          <w:p>
-            <w:pPr>
-              <w:spacing w:before="60"/>
-            </w:pPr>
-            <w:r>
-              <w:rPr>
-                <w:rFonts w:ascii="Calibri" w:cs="Calibri" w:eastAsia="Calibri" w:hAnsi="Calibri"/>
-                <w:i/>
-                <w:iCs/>
-                <w:color w:val="5B7482"/>
-                <w:sz w:val="24"/>
-                <w:szCs w:val="24"/>
-              </w:rPr>
-              <w:t xml:space="preserve">Mission question: “Why is it hot in summer and cold in winter?”</w:t>
-            </w:r>
-          </w:p>
-        </w:tc>
-      </w:tr>
-    </w:tbl>
-    <w:p>
-      <w:pPr>
-        <w:spacing w:after="160"/>
-      </w:pPr>
+    <w:p>
+      <w:r>
+        <w:rPr>
+          <w:rFonts w:ascii="Calibri" w:cs="Calibri" w:eastAsia="Calibri" w:hAnsi="Calibri"/>
+          <w:b/>
+          <w:bCs/>
+          <w:color w:val="3B7EA1"/>
+          <w:spacing w:val="40"/>
+          <w:sz w:val="20"/>
+          <w:szCs w:val="20"/>
+        </w:rPr>
+        <w:t xml:space="preserve">MISSION 3</w:t>
+      </w:r>
     </w:p>
     <w:p>
       <w:pPr>
@@ -765,32 +472,22 @@
           <w:sz w:val="24"/>
           <w:szCs w:val="24"/>
         </w:rPr>
-        <w:t xml:space="preserve">OUR EVIDENCE TYPE  —  tick all that apply</w:t>
-      </w:r>
-    </w:p>
-    <w:p>
-      <w:pPr>
-        <w:spacing w:after="60"/>
-      </w:pPr>
-      <w:r>
-        <w:rPr>
-          <w:rFonts w:ascii="Calibri" w:cs="Calibri" w:eastAsia="Calibri" w:hAnsi="Calibri"/>
-          <w:color w:val="013148"/>
-          <w:sz w:val="24"/>
-          <w:szCs w:val="24"/>
-        </w:rPr>
-        <w:t xml:space="preserve">☐ Graph      ☐ Model      ☐ Photograph      ☐ Diagram</w:t>
-      </w:r>
-    </w:p>
-    <w:p>
-      <w:r>
-        <w:rPr>
-          <w:rFonts w:ascii="Calibri" w:cs="Calibri" w:eastAsia="Calibri" w:hAnsi="Calibri"/>
-          <w:color w:val="013148"/>
-          <w:sz w:val="24"/>
-          <w:szCs w:val="24"/>
-        </w:rPr>
-        <w:t xml:space="preserve">☐ Observation      ☐ Data      ☐ Scientific explanation</w:t>
+        <w:t xml:space="preserve">TYPE OF EVIDENCE</w:t>
+      </w:r>
+    </w:p>
+    <w:p>
+      <w:pPr>
+        <w:pBdr>
+          <w:bottom w:val="single" w:color="9DB4BE" w:sz="6" w:space="1"/>
+        </w:pBdr>
+        <w:spacing w:before="320"/>
+      </w:pPr>
+      <w:r>
+        <w:rPr>
+          <w:sz w:val="24"/>
+          <w:szCs w:val="24"/>
+        </w:rPr>
+        <w:t xml:space="preserve"> </w:t>
       </w:r>
     </w:p>
     <w:p>
@@ -826,7 +523,7 @@
       </w:tblGrid>
       <w:tr>
         <w:trPr>
-          <w:trHeight w:val="6600" w:hRule="atLeast"/>
+          <w:trHeight w:val="9700" w:hRule="atLeast"/>
         </w:trPr>
         <w:tc>
           <w:tcPr>
@@ -894,7 +591,7 @@
     </w:p>
     <w:p>
       <w:pPr>
-        <w:spacing w:before="300"/>
+        <w:spacing w:before="240"/>
         <w:jc w:val="center"/>
       </w:pPr>
       <w:r>
@@ -911,7 +608,7 @@
       <w:pPr>
         <w:sectPr>
           <w:pgSz w:w="11906" w:h="16838" w:orient="portrait"/>
-          <w:pgMar w:top="900" w:right="1000" w:bottom="700" w:left="1000" w:header="708" w:footer="708" w:gutter="0"/>
+          <w:pgMar w:top="800" w:right="1000" w:bottom="600" w:left="1000" w:header="708" w:footer="708" w:gutter="0"/>
           <w:pgBorders w:display="allPages" w:offsetFrom="page">
             <w:top w:val="single" w:color="8FC9E8" w:sz="28" w:space="20"/>
             <w:left w:val="single" w:color="8FC9E8" w:sz="28" w:space="20"/>
@@ -923,110 +620,19 @@
         </w:sectPr>
       </w:pPr>
     </w:p>
-    <w:tbl>
-      <w:tblPr>
-        <w:tblW w:type="dxa" w:w="9906"/>
-        <w:tblBorders>
-          <w:top w:val="none" w:color="FFFFFF" w:sz="0"/>
-          <w:left w:val="none" w:color="FFFFFF" w:sz="0"/>
-          <w:bottom w:val="none" w:color="FFFFFF" w:sz="0"/>
-          <w:right w:val="none" w:color="FFFFFF" w:sz="0"/>
-          <w:insideH w:val="single" w:color="auto" w:sz="4"/>
-          <w:insideV w:val="single" w:color="auto" w:sz="4"/>
-        </w:tblBorders>
-      </w:tblPr>
-      <w:tblGrid>
-        <w:gridCol w:w="200"/>
-        <w:gridCol w:w="9706"/>
-      </w:tblGrid>
-      <w:tr>
-        <w:tc>
-          <w:tcPr>
-            <w:tcW w:type="dxa" w:w="200"/>
-            <w:tcBorders>
-              <w:top w:val="none" w:color="FFFFFF" w:sz="0"/>
-              <w:left w:val="none" w:color="FFFFFF" w:sz="0"/>
-              <w:bottom w:val="none" w:color="FFFFFF" w:sz="0"/>
-              <w:right w:val="none" w:color="FFFFFF" w:sz="0"/>
-            </w:tcBorders>
-            <w:shd w:fill="F38C9F" w:val="clear"/>
-          </w:tcPr>
-          <w:p>
-            <w:r>
-              <w:t xml:space="preserve"/>
-            </w:r>
-          </w:p>
-        </w:tc>
-        <w:tc>
-          <w:tcPr>
-            <w:tcW w:type="dxa" w:w="9706"/>
-            <w:tcBorders>
-              <w:top w:val="none" w:color="FFFFFF" w:sz="0"/>
-              <w:left w:val="none" w:color="FFFFFF" w:sz="0"/>
-              <w:bottom w:val="none" w:color="FFFFFF" w:sz="0"/>
-              <w:right w:val="none" w:color="FFFFFF" w:sz="0"/>
-            </w:tcBorders>
-            <w:shd w:fill="FDEAEE" w:val="clear"/>
-            <w:tcMar>
-              <w:top w:type="dxa" w:w="160"/>
-              <w:left w:type="dxa" w:w="240"/>
-              <w:bottom w:type="dxa" w:w="160"/>
-              <w:right w:type="dxa" w:w="240"/>
-            </w:tcMar>
-          </w:tcPr>
-          <w:p>
-            <w:r>
-              <w:rPr>
-                <w:rFonts w:ascii="Calibri" w:cs="Calibri" w:eastAsia="Calibri" w:hAnsi="Calibri"/>
-                <w:b/>
-                <w:bCs/>
-                <w:color w:val="013148"/>
-                <w:spacing w:val="30"/>
-                <w:sz w:val="20"/>
-                <w:szCs w:val="20"/>
-              </w:rPr>
-              <w:t xml:space="preserve">MISSION 4  ·  MOON INVESTIGATOR</w:t>
-            </w:r>
-          </w:p>
-          <w:p>
-            <w:pPr>
-              <w:spacing w:before="60"/>
-            </w:pPr>
-            <w:r>
-              <w:rPr>
-                <w:rFonts w:ascii="Calibri" w:cs="Calibri" w:eastAsia="Calibri" w:hAnsi="Calibri"/>
-                <w:b/>
-                <w:bCs/>
-                <w:color w:val="013148"/>
-                <w:sz w:val="52"/>
-                <w:szCs w:val="52"/>
-              </w:rPr>
-              <w:t xml:space="preserve">Why Does the Moon Change Shape?</w:t>
-            </w:r>
-          </w:p>
-          <w:p>
-            <w:pPr>
-              <w:spacing w:before="60"/>
-            </w:pPr>
-            <w:r>
-              <w:rPr>
-                <w:rFonts w:ascii="Calibri" w:cs="Calibri" w:eastAsia="Calibri" w:hAnsi="Calibri"/>
-                <w:i/>
-                <w:iCs/>
-                <w:color w:val="5B7482"/>
-                <w:sz w:val="24"/>
-                <w:szCs w:val="24"/>
-              </w:rPr>
-              <w:t xml:space="preserve">Mission question: “What causes the phases of the Moon?”</w:t>
-            </w:r>
-          </w:p>
-        </w:tc>
-      </w:tr>
-    </w:tbl>
-    <w:p>
-      <w:pPr>
-        <w:spacing w:after="160"/>
-      </w:pPr>
+    <w:p>
+      <w:r>
+        <w:rPr>
+          <w:rFonts w:ascii="Calibri" w:cs="Calibri" w:eastAsia="Calibri" w:hAnsi="Calibri"/>
+          <w:b/>
+          <w:bCs/>
+          <w:color w:val="F38C9F"/>
+          <w:spacing w:val="40"/>
+          <w:sz w:val="20"/>
+          <w:szCs w:val="20"/>
+        </w:rPr>
+        <w:t xml:space="preserve">MISSION 4</w:t>
+      </w:r>
     </w:p>
     <w:p>
       <w:pPr>
@@ -1072,32 +678,22 @@
           <w:sz w:val="24"/>
           <w:szCs w:val="24"/>
         </w:rPr>
-        <w:t xml:space="preserve">OUR EVIDENCE TYPE  —  tick all that apply</w:t>
-      </w:r>
-    </w:p>
-    <w:p>
-      <w:pPr>
-        <w:spacing w:after="60"/>
-      </w:pPr>
-      <w:r>
-        <w:rPr>
-          <w:rFonts w:ascii="Calibri" w:cs="Calibri" w:eastAsia="Calibri" w:hAnsi="Calibri"/>
-          <w:color w:val="013148"/>
-          <w:sz w:val="24"/>
-          <w:szCs w:val="24"/>
-        </w:rPr>
-        <w:t xml:space="preserve">☐ Graph      ☐ Model      ☐ Photograph      ☐ Diagram</w:t>
-      </w:r>
-    </w:p>
-    <w:p>
-      <w:r>
-        <w:rPr>
-          <w:rFonts w:ascii="Calibri" w:cs="Calibri" w:eastAsia="Calibri" w:hAnsi="Calibri"/>
-          <w:color w:val="013148"/>
-          <w:sz w:val="24"/>
-          <w:szCs w:val="24"/>
-        </w:rPr>
-        <w:t xml:space="preserve">☐ Observation      ☐ Data      ☐ Scientific explanation</w:t>
+        <w:t xml:space="preserve">TYPE OF EVIDENCE</w:t>
+      </w:r>
+    </w:p>
+    <w:p>
+      <w:pPr>
+        <w:pBdr>
+          <w:bottom w:val="single" w:color="9DB4BE" w:sz="6" w:space="1"/>
+        </w:pBdr>
+        <w:spacing w:before="320"/>
+      </w:pPr>
+      <w:r>
+        <w:rPr>
+          <w:sz w:val="24"/>
+          <w:szCs w:val="24"/>
+        </w:rPr>
+        <w:t xml:space="preserve"> </w:t>
       </w:r>
     </w:p>
     <w:p>
@@ -1133,7 +729,7 @@
       </w:tblGrid>
       <w:tr>
         <w:trPr>
-          <w:trHeight w:val="6600" w:hRule="atLeast"/>
+          <w:trHeight w:val="9700" w:hRule="atLeast"/>
         </w:trPr>
         <w:tc>
           <w:tcPr>
@@ -1201,7 +797,7 @@
     </w:p>
     <w:p>
       <w:pPr>
-        <w:spacing w:before="300"/>
+        <w:spacing w:before="240"/>
         <w:jc w:val="center"/>
       </w:pPr>
       <w:r>
@@ -1218,7 +814,7 @@
       <w:pPr>
         <w:sectPr>
           <w:pgSz w:w="11906" w:h="16838" w:orient="portrait"/>
-          <w:pgMar w:top="900" w:right="1000" w:bottom="700" w:left="1000" w:header="708" w:footer="708" w:gutter="0"/>
+          <w:pgMar w:top="800" w:right="1000" w:bottom="600" w:left="1000" w:header="708" w:footer="708" w:gutter="0"/>
           <w:pgBorders w:display="allPages" w:offsetFrom="page">
             <w:top w:val="single" w:color="F38C9F" w:sz="28" w:space="20"/>
             <w:left w:val="single" w:color="F38C9F" w:sz="28" w:space="20"/>
@@ -1230,110 +826,19 @@
         </w:sectPr>
       </w:pPr>
     </w:p>
-    <w:tbl>
-      <w:tblPr>
-        <w:tblW w:type="dxa" w:w="9906"/>
-        <w:tblBorders>
-          <w:top w:val="none" w:color="FFFFFF" w:sz="0"/>
-          <w:left w:val="none" w:color="FFFFFF" w:sz="0"/>
-          <w:bottom w:val="none" w:color="FFFFFF" w:sz="0"/>
-          <w:right w:val="none" w:color="FFFFFF" w:sz="0"/>
-          <w:insideH w:val="single" w:color="auto" w:sz="4"/>
-          <w:insideV w:val="single" w:color="auto" w:sz="4"/>
-        </w:tblBorders>
-      </w:tblPr>
-      <w:tblGrid>
-        <w:gridCol w:w="200"/>
-        <w:gridCol w:w="9706"/>
-      </w:tblGrid>
-      <w:tr>
-        <w:tc>
-          <w:tcPr>
-            <w:tcW w:type="dxa" w:w="200"/>
-            <w:tcBorders>
-              <w:top w:val="none" w:color="FFFFFF" w:sz="0"/>
-              <w:left w:val="none" w:color="FFFFFF" w:sz="0"/>
-              <w:bottom w:val="none" w:color="FFFFFF" w:sz="0"/>
-              <w:right w:val="none" w:color="FFFFFF" w:sz="0"/>
-            </w:tcBorders>
-            <w:shd w:fill="7AC698" w:val="clear"/>
-          </w:tcPr>
-          <w:p>
-            <w:r>
-              <w:t xml:space="preserve"/>
-            </w:r>
-          </w:p>
-        </w:tc>
-        <w:tc>
-          <w:tcPr>
-            <w:tcW w:type="dxa" w:w="9706"/>
-            <w:tcBorders>
-              <w:top w:val="none" w:color="FFFFFF" w:sz="0"/>
-              <w:left w:val="none" w:color="FFFFFF" w:sz="0"/>
-              <w:bottom w:val="none" w:color="FFFFFF" w:sz="0"/>
-              <w:right w:val="none" w:color="FFFFFF" w:sz="0"/>
-            </w:tcBorders>
-            <w:shd w:fill="E4F4EA" w:val="clear"/>
-            <w:tcMar>
-              <w:top w:type="dxa" w:w="160"/>
-              <w:left w:type="dxa" w:w="240"/>
-              <w:bottom w:type="dxa" w:w="160"/>
-              <w:right w:type="dxa" w:w="240"/>
-            </w:tcMar>
-          </w:tcPr>
-          <w:p>
-            <w:r>
-              <w:rPr>
-                <w:rFonts w:ascii="Calibri" w:cs="Calibri" w:eastAsia="Calibri" w:hAnsi="Calibri"/>
-                <w:b/>
-                <w:bCs/>
-                <w:color w:val="013148"/>
-                <w:spacing w:val="30"/>
-                <w:sz w:val="20"/>
-                <w:szCs w:val="20"/>
-              </w:rPr>
-              <w:t xml:space="preserve">MISSION 5  ·  OCEAN SYSTEMS RESEARCHER</w:t>
-            </w:r>
-          </w:p>
-          <w:p>
-            <w:pPr>
-              <w:spacing w:before="60"/>
-            </w:pPr>
-            <w:r>
-              <w:rPr>
-                <w:rFonts w:ascii="Calibri" w:cs="Calibri" w:eastAsia="Calibri" w:hAnsi="Calibri"/>
-                <w:b/>
-                <w:bCs/>
-                <w:color w:val="013148"/>
-                <w:sz w:val="52"/>
-                <w:szCs w:val="52"/>
-              </w:rPr>
-              <w:t xml:space="preserve">What Causes the Tides?</w:t>
-            </w:r>
-          </w:p>
-          <w:p>
-            <w:pPr>
-              <w:spacing w:before="60"/>
-            </w:pPr>
-            <w:r>
-              <w:rPr>
-                <w:rFonts w:ascii="Calibri" w:cs="Calibri" w:eastAsia="Calibri" w:hAnsi="Calibri"/>
-                <w:i/>
-                <w:iCs/>
-                <w:color w:val="5B7482"/>
-                <w:sz w:val="24"/>
-                <w:szCs w:val="24"/>
-              </w:rPr>
-              <w:t xml:space="preserve">Mission question: “Why does the ocean rise and fall each day?”</w:t>
-            </w:r>
-          </w:p>
-        </w:tc>
-      </w:tr>
-    </w:tbl>
-    <w:p>
-      <w:pPr>
-        <w:spacing w:after="160"/>
-      </w:pPr>
+    <w:p>
+      <w:r>
+        <w:rPr>
+          <w:rFonts w:ascii="Calibri" w:cs="Calibri" w:eastAsia="Calibri" w:hAnsi="Calibri"/>
+          <w:b/>
+          <w:bCs/>
+          <w:color w:val="7AC698"/>
+          <w:spacing w:val="40"/>
+          <w:sz w:val="20"/>
+          <w:szCs w:val="20"/>
+        </w:rPr>
+        <w:t xml:space="preserve">MISSION 5</w:t>
+      </w:r>
     </w:p>
     <w:p>
       <w:pPr>
@@ -1379,32 +884,22 @@
           <w:sz w:val="24"/>
           <w:szCs w:val="24"/>
         </w:rPr>
-        <w:t xml:space="preserve">OUR EVIDENCE TYPE  —  tick all that apply</w:t>
-      </w:r>
-    </w:p>
-    <w:p>
-      <w:pPr>
-        <w:spacing w:after="60"/>
-      </w:pPr>
-      <w:r>
-        <w:rPr>
-          <w:rFonts w:ascii="Calibri" w:cs="Calibri" w:eastAsia="Calibri" w:hAnsi="Calibri"/>
-          <w:color w:val="013148"/>
-          <w:sz w:val="24"/>
-          <w:szCs w:val="24"/>
-        </w:rPr>
-        <w:t xml:space="preserve">☐ Graph      ☐ Model      ☐ Photograph      ☐ Diagram</w:t>
-      </w:r>
-    </w:p>
-    <w:p>
-      <w:r>
-        <w:rPr>
-          <w:rFonts w:ascii="Calibri" w:cs="Calibri" w:eastAsia="Calibri" w:hAnsi="Calibri"/>
-          <w:color w:val="013148"/>
-          <w:sz w:val="24"/>
-          <w:szCs w:val="24"/>
-        </w:rPr>
-        <w:t xml:space="preserve">☐ Observation      ☐ Data      ☐ Scientific explanation</w:t>
+        <w:t xml:space="preserve">TYPE OF EVIDENCE</w:t>
+      </w:r>
+    </w:p>
+    <w:p>
+      <w:pPr>
+        <w:pBdr>
+          <w:bottom w:val="single" w:color="9DB4BE" w:sz="6" w:space="1"/>
+        </w:pBdr>
+        <w:spacing w:before="320"/>
+      </w:pPr>
+      <w:r>
+        <w:rPr>
+          <w:sz w:val="24"/>
+          <w:szCs w:val="24"/>
+        </w:rPr>
+        <w:t xml:space="preserve"> </w:t>
       </w:r>
     </w:p>
     <w:p>
@@ -1440,7 +935,7 @@
       </w:tblGrid>
       <w:tr>
         <w:trPr>
-          <w:trHeight w:val="6600" w:hRule="atLeast"/>
+          <w:trHeight w:val="9700" w:hRule="atLeast"/>
         </w:trPr>
         <w:tc>
           <w:tcPr>
@@ -1508,7 +1003,7 @@
     </w:p>
     <w:p>
       <w:pPr>
-        <w:spacing w:before="300"/>
+        <w:spacing w:before="240"/>
         <w:jc w:val="center"/>
       </w:pPr>
       <w:r>
@@ -1523,7 +1018,7 @@
     </w:p>
     <w:sectPr>
       <w:pgSz w:w="11906" w:h="16838" w:orient="portrait"/>
-      <w:pgMar w:top="900" w:right="1000" w:bottom="700" w:left="1000" w:header="708" w:footer="708" w:gutter="0"/>
+      <w:pgMar w:top="800" w:right="1000" w:bottom="600" w:left="1000" w:header="708" w:footer="708" w:gutter="0"/>
       <w:pgBorders w:display="allPages" w:offsetFrom="page">
         <w:top w:val="single" w:color="7AC698" w:sz="28" w:space="20"/>
         <w:left w:val="single" w:color="7AC698" w:sz="28" w:space="20"/>

</xml_diff>